<commit_message>
Place Vision within Shape the Outcome
</commit_message>
<xml_diff>
--- a/data1/LIM_CELL_INVENTORY.docx
+++ b/data1/LIM_CELL_INVENTORY.docx
@@ -15,12 +15,12 @@
         <w:pStyle w:val="Subtitle"/>
       </w:pPr>
       <w:r>
-        <w:t>Current introductory cells and eight face learning mesh</w:t>
-      </w:r>
-    </w:p>
-    <w:p>
-      <w:r>
-        <w:t>This editable inventory records the Learning Information Mesh content used by the NourishlandXR introductory demo. It begins with Vision and the four optional learning paths, then lists the eight faces of the full mesh and their cells. Stable IDs, parent relationships and current companion text support content review and later updates without confusing these learning cells with plant profiles.</w:t>
+        <w:t>Current four archetypes and eight face learning mesh</w:t>
+      </w:r>
+    </w:p>
+    <w:p>
+      <w:r>
+        <w:t>This editable inventory records the Learning Information Mesh content used by the NourishlandXR introductory demo. It begins with four optional learning archetypes. Vision now belongs inside Shape the Outcome, alongside the cells that turn direction into goals, decisions and feedback. The inventory then lists the eight faces of the full mesh and their cells. Stable IDs, parent relationships and current companion text support safe content review and updates.</w:t>
       </w:r>
     </w:p>
     <w:p>
@@ -33,7 +33,7 @@
           <w:color w:val="505050"/>
           <w:sz w:val="18"/>
         </w:rPr>
-        <w:t>Source  app/services/limLearning.js    Verified against app/screens/temporaryArDemo.js    Updated 20 September 2026</w:t>
+        <w:t>Source  app/services/limLearning.js    Verified against app/screens/temporaryArDemo.js    Updated 23 September 2026</w:t>
       </w:r>
     </w:p>
     <w:p>
@@ -46,7 +46,7 @@
     </w:p>
     <w:p>
       <w:r>
-        <w:t>Vision is the opening conceptual cell. Its four paths unfold when the visitor selects it; the cells remain optional during the demo. The full LIM has 97 cells arranged under eight public faces. Ninety three of these retain the original Climate, Food forest, Plant and Pin IDs, while four face cells were added. The original group and parent IDs remain in the catalogue because they are useful for mapping content and saved state.</w:t>
+        <w:t>Four archetypes form the introductory entry points: Read Nature, Understand the Land, Design the Forest and Shape the Outcome. Their cells remain optional during the demo and unfold only when an archetype is selected. Vision is a child of Shape the Outcome rather than a separate gate. The full LIM has 97 cells arranged under eight public faces. Ninety three retain the original Climate, Food forest, Plant and Pin IDs, while four face cells were added.</w:t>
       </w:r>
     </w:p>
     <w:tbl>
@@ -143,14 +143,8 @@
             <w:vAlign w:val="center"/>
           </w:tcPr>
           <w:p>
-            <w:pPr>
-              <w:spacing w:after="0"/>
-            </w:pPr>
             <w:r>
-              <w:rPr>
-                <w:sz w:val="19"/>
-              </w:rPr>
-              <w:t>Vision</w:t>
+              <w:t>Four archetypes</w:t>
             </w:r>
           </w:p>
         </w:tc>
@@ -160,14 +154,8 @@
             <w:vAlign w:val="center"/>
           </w:tcPr>
           <w:p>
-            <w:pPr>
-              <w:spacing w:after="0"/>
-            </w:pPr>
             <w:r>
-              <w:rPr>
-                <w:sz w:val="19"/>
-              </w:rPr>
-              <w:t>1</w:t>
+              <w:t>4</w:t>
             </w:r>
           </w:p>
         </w:tc>
@@ -177,14 +165,8 @@
             <w:vAlign w:val="center"/>
           </w:tcPr>
           <w:p>
-            <w:pPr>
-              <w:spacing w:after="0"/>
-            </w:pPr>
             <w:r>
-              <w:rPr>
-                <w:sz w:val="19"/>
-              </w:rPr>
-              <w:t>Opening idea and invitation</w:t>
+              <w:t>Read Nature, Understand the Land, Design the Forest and Shape the Outcome</w:t>
             </w:r>
           </w:p>
         </w:tc>
@@ -196,14 +178,8 @@
             <w:vAlign w:val="center"/>
           </w:tcPr>
           <w:p>
-            <w:pPr>
-              <w:spacing w:after="0"/>
-            </w:pPr>
             <w:r>
-              <w:rPr>
-                <w:sz w:val="19"/>
-              </w:rPr>
-              <w:t>Four learning paths</w:t>
+              <w:t>Archetype topics</w:t>
             </w:r>
           </w:p>
         </w:tc>
@@ -213,14 +189,8 @@
             <w:vAlign w:val="center"/>
           </w:tcPr>
           <w:p>
-            <w:pPr>
-              <w:spacing w:after="0"/>
-            </w:pPr>
             <w:r>
-              <w:rPr>
-                <w:sz w:val="19"/>
-              </w:rPr>
-              <w:t>4</w:t>
+              <w:t>23</w:t>
             </w:r>
           </w:p>
         </w:tc>
@@ -230,67 +200,8 @@
             <w:vAlign w:val="center"/>
           </w:tcPr>
           <w:p>
-            <w:pPr>
-              <w:spacing w:after="0"/>
-            </w:pPr>
             <w:r>
-              <w:rPr>
-                <w:sz w:val="19"/>
-              </w:rPr>
-              <w:t>Read the Place, Understand Life, Design the Forest and Shape the Outcome</w:t>
-            </w:r>
-          </w:p>
-        </w:tc>
-      </w:tr>
-      <w:tr>
-        <w:tc>
-          <w:tcPr>
-            <w:tcW w:type="dxa" w:w="2304"/>
-            <w:vAlign w:val="center"/>
-          </w:tcPr>
-          <w:p>
-            <w:pPr>
-              <w:spacing w:after="0"/>
-            </w:pPr>
-            <w:r>
-              <w:rPr>
-                <w:sz w:val="19"/>
-              </w:rPr>
-              <w:t>Path topics</w:t>
-            </w:r>
-          </w:p>
-        </w:tc>
-        <w:tc>
-          <w:tcPr>
-            <w:tcW w:type="dxa" w:w="1800"/>
-            <w:vAlign w:val="center"/>
-          </w:tcPr>
-          <w:p>
-            <w:pPr>
-              <w:spacing w:after="0"/>
-            </w:pPr>
-            <w:r>
-              <w:rPr>
-                <w:sz w:val="19"/>
-              </w:rPr>
-              <w:t>22</w:t>
-            </w:r>
-          </w:p>
-        </w:tc>
-        <w:tc>
-          <w:tcPr>
-            <w:tcW w:type="dxa" w:w="5832"/>
-            <w:vAlign w:val="center"/>
-          </w:tcPr>
-          <w:p>
-            <w:pPr>
-              <w:spacing w:after="0"/>
-            </w:pPr>
-            <w:r>
-              <w:rPr>
-                <w:sz w:val="19"/>
-              </w:rPr>
-              <w:t>Detailed learning cells under the four paths</w:t>
+              <w:t>Detailed cells under the four archetypes, including Vision under Shape the Outcome</w:t>
             </w:r>
           </w:p>
         </w:tc>
@@ -417,7 +328,7 @@
         <w:pStyle w:val="Heading1"/>
       </w:pPr>
       <w:r>
-        <w:t>Vision and four learning paths</w:t>
+        <w:t>Four archetypes and introductory cells</w:t>
       </w:r>
     </w:p>
     <w:p>
@@ -425,7 +336,7 @@
         <w:pStyle w:val="Heading2"/>
       </w:pPr>
       <w:r>
-        <w:t>Vision</w:t>
+        <w:t>Read Nature</w:t>
       </w:r>
     </w:p>
     <w:p>
@@ -438,12 +349,12 @@
           <w:color w:val="505050"/>
           <w:sz w:val="18"/>
         </w:rPr>
-        <w:t>Stable ID  lim-intro-vision    Parent ID  none</w:t>
-      </w:r>
-    </w:p>
-    <w:p>
-      <w:r>
-        <w:t>NourishlandXR begins with a vision: use technology to help people notice, understand and care for living systems. The mesh turns that intention into a cycle of seeing, learning, designing, acting and returning to observe what changed.</w:t>
+        <w:t>Stable ID  lim-intro-analysis    Parent ID  none</w:t>
+      </w:r>
+    </w:p>
+    <w:p>
+      <w:r>
+        <w:t>Read Nature begins with the conditions already shaping a site before a solution is proposed. Climate, topography, landscape patterns and practical strategy reveal constraints, opportunities and relationships that a single photograph can hide.</w:t>
       </w:r>
     </w:p>
     <w:p>
@@ -457,7 +368,7 @@
         <w:t xml:space="preserve">Explore  </w:t>
       </w:r>
       <w:r>
-        <w:t>Read the place · Understand life · Design the forest · Shape the outcome</w:t>
+        <w:t>Climate · Topography · Landscape · Strategy</w:t>
       </w:r>
     </w:p>
     <w:p>
@@ -471,7 +382,7 @@
         <w:t xml:space="preserve">Look for  </w:t>
       </w:r>
       <w:r>
-        <w:t>A place is never only a backdrop. Plants, people, weather, time and care are part of the same living story.</w:t>
+        <w:t>Sun, shade, slope, water movement, wind, access, existing vegetation, human use and signs of change through time.</w:t>
       </w:r>
     </w:p>
     <w:p>
@@ -485,7 +396,7 @@
         <w:t xml:space="preserve">Ask  </w:t>
       </w:r>
       <w:r>
-        <w:t>What would you notice if the interface helped you look more closely instead of giving you an answer first?</w:t>
+        <w:t>Which condition is shaping the place most strongly right now, and what evidence supports that reading?</w:t>
       </w:r>
     </w:p>
     <w:p>
@@ -499,7 +410,21 @@
         <w:t xml:space="preserve">Next  </w:t>
       </w:r>
       <w:r>
-        <w:t>Select Read the Place, Understand Life, Design the Forest or Shape the Outcome to choose a way into the story.</w:t>
+        <w:t>Compare Climate, Topography and Landscape, then use Strategy to choose the next useful observation.</w:t>
+      </w:r>
+    </w:p>
+    <w:p>
+      <w:pPr>
+        <w:spacing w:after="80"/>
+      </w:pPr>
+      <w:r>
+        <w:rPr>
+          <w:b/>
+        </w:rPr>
+        <w:t xml:space="preserve">Connect  </w:t>
+      </w:r>
+      <w:r>
+        <w:t>Feedback</w:t>
       </w:r>
     </w:p>
     <w:p>
@@ -517,10 +442,10 @@
     </w:p>
     <w:p>
       <w:pPr>
-        <w:pStyle w:val="Heading2"/>
-      </w:pPr>
-      <w:r>
-        <w:t>Read the Place</w:t>
+        <w:pStyle w:val="Heading3"/>
+      </w:pPr>
+      <w:r>
+        <w:t>Climate</w:t>
       </w:r>
     </w:p>
     <w:p>
@@ -533,12 +458,12 @@
           <w:color w:val="505050"/>
           <w:sz w:val="18"/>
         </w:rPr>
-        <w:t>Stable ID  lim-intro-analysis    Parent ID  lim-intro-vision</w:t>
-      </w:r>
-    </w:p>
-    <w:p>
-      <w:r>
-        <w:t>Read the Place begins with the conditions already shaping a site before a solution is proposed. Climate, topography, landscape patterns and practical strategy reveal constraints, opportunities and relationships that a single photograph can hide.</w:t>
+        <w:t>Stable ID  lim-intro-analysis-climate    Parent ID  lim-intro-analysis</w:t>
+      </w:r>
+    </w:p>
+    <w:p>
+      <w:r>
+        <w:t>Climate describes recurring patterns of temperature, rainfall, season and exposure. A broad climate label is only a starting point: buildings, hollows, canopy, wind and recent weather create microclimates that can change what grows across a few metres.</w:t>
       </w:r>
     </w:p>
     <w:p>
@@ -552,7 +477,7 @@
         <w:t xml:space="preserve">Explore  </w:t>
       </w:r>
       <w:r>
-        <w:t>Climate · Topography · Landscape · Strategy</w:t>
+        <w:t>Seasons · Temperature · Rainfall · Wind · Frost and heat · Microclimates</w:t>
       </w:r>
     </w:p>
     <w:p>
@@ -566,7 +491,7 @@
         <w:t xml:space="preserve">Look for  </w:t>
       </w:r>
       <w:r>
-        <w:t>Sun, shade, slope, water movement, wind, access, existing vegetation, human use and signs of change through time.</w:t>
+        <w:t>Seasonal timing, frost pockets, reflected heat, damp edges, wind exposure and differences between sheltered and open positions.</w:t>
       </w:r>
     </w:p>
     <w:p>
@@ -580,7 +505,7 @@
         <w:t xml:space="preserve">Ask  </w:t>
       </w:r>
       <w:r>
-        <w:t>Which condition is shaping the place most strongly right now, and what evidence supports that reading?</w:t>
+        <w:t>Where does this place behave differently from the wider climate description, and which observation supports that conclusion?</w:t>
       </w:r>
     </w:p>
     <w:p>
@@ -594,7 +519,7 @@
         <w:t xml:space="preserve">Next  </w:t>
       </w:r>
       <w:r>
-        <w:t>Compare Climate, Topography and Landscape, then use Strategy to choose the next useful observation.</w:t>
+        <w:t>Connect Climate with Plant needs, then compare it with Topography to explain local variation.</w:t>
       </w:r>
     </w:p>
     <w:p>
@@ -608,7 +533,7 @@
         <w:t xml:space="preserve">Connect  </w:t>
       </w:r>
       <w:r>
-        <w:t>Feedback</w:t>
+        <w:t>Plants</w:t>
       </w:r>
     </w:p>
     <w:p>
@@ -629,7 +554,7 @@
         <w:pStyle w:val="Heading3"/>
       </w:pPr>
       <w:r>
-        <w:t>Climate</w:t>
+        <w:t>Topography</w:t>
       </w:r>
     </w:p>
     <w:p>
@@ -642,12 +567,12 @@
           <w:color w:val="505050"/>
           <w:sz w:val="18"/>
         </w:rPr>
-        <w:t>Stable ID  lim-intro-analysis-climate    Parent ID  lim-intro-analysis</w:t>
-      </w:r>
-    </w:p>
-    <w:p>
-      <w:r>
-        <w:t>Climate describes recurring patterns of temperature, rainfall, season and exposure. A broad climate label is only a starting point: buildings, hollows, canopy, wind and recent weather create microclimates that can change what grows across a few metres.</w:t>
+        <w:t>Stable ID  lim-intro-analysis-topography    Parent ID  lim-intro-analysis</w:t>
+      </w:r>
+    </w:p>
+    <w:p>
+      <w:r>
+        <w:t>Topography is the shape and level of land. Elevation, slope and aspect influence water movement, sun, wind, access and where growing conditions form, so a small change in height can produce a meaningful change in the living system.</w:t>
       </w:r>
     </w:p>
     <w:p>
@@ -661,7 +586,7 @@
         <w:t xml:space="preserve">Explore  </w:t>
       </w:r>
       <w:r>
-        <w:t>Seasons · Temperature · Rainfall · Wind · Frost and heat · Microclimates</w:t>
+        <w:t>Elevation · Slope · Aspect · Drainage · Erosion · High and low points</w:t>
       </w:r>
     </w:p>
     <w:p>
@@ -675,7 +600,7 @@
         <w:t xml:space="preserve">Look for  </w:t>
       </w:r>
       <w:r>
-        <w:t>Seasonal timing, frost pockets, reflected heat, damp edges, wind exposure and differences between sheltered and open positions.</w:t>
+        <w:t>High and low points, contours, runoff paths, pooling, erosion, stable ground, aspect and difficult access.</w:t>
       </w:r>
     </w:p>
     <w:p>
@@ -689,7 +614,7 @@
         <w:t xml:space="preserve">Ask  </w:t>
       </w:r>
       <w:r>
-        <w:t>Where does this place behave differently from the wider climate description, and which observation supports that conclusion?</w:t>
+        <w:t>Where would water, people, seeds and roots naturally travel if no path or drain had been built?</w:t>
       </w:r>
     </w:p>
     <w:p>
@@ -703,7 +628,7 @@
         <w:t xml:space="preserve">Next  </w:t>
       </w:r>
       <w:r>
-        <w:t>Connect Climate with Plant needs, then compare it with Topography to explain local variation.</w:t>
+        <w:t>Connect Topography with Water, then bring the result into Landscape and Strategy.</w:t>
       </w:r>
     </w:p>
     <w:p>
@@ -717,7 +642,7 @@
         <w:t xml:space="preserve">Connect  </w:t>
       </w:r>
       <w:r>
-        <w:t>Plants</w:t>
+        <w:t>Water</w:t>
       </w:r>
     </w:p>
     <w:p>
@@ -738,7 +663,7 @@
         <w:pStyle w:val="Heading3"/>
       </w:pPr>
       <w:r>
-        <w:t>Topography</w:t>
+        <w:t>Landscape</w:t>
       </w:r>
     </w:p>
     <w:p>
@@ -751,12 +676,12 @@
           <w:color w:val="505050"/>
           <w:sz w:val="18"/>
         </w:rPr>
-        <w:t>Stable ID  lim-intro-analysis-topography    Parent ID  lim-intro-analysis</w:t>
-      </w:r>
-    </w:p>
-    <w:p>
-      <w:r>
-        <w:t>Topography is the shape and level of land. Elevation, slope and aspect influence water movement, sun, wind, access and where growing conditions form, so a small change in height can produce a meaningful change in the living system.</w:t>
+        <w:t>Stable ID  lim-intro-analysis-landscape    Parent ID  lim-intro-analysis</w:t>
+      </w:r>
+    </w:p>
+    <w:p>
+      <w:r>
+        <w:t>Landscape brings landform, soil, water, vegetation, wildlife, built elements and people into one view. Read their relationships before isolating a single feature; the most useful pattern is often found at an edge, transition or point of repeated use.</w:t>
       </w:r>
     </w:p>
     <w:p>
@@ -770,7 +695,7 @@
         <w:t xml:space="preserve">Explore  </w:t>
       </w:r>
       <w:r>
-        <w:t>Elevation · Slope · Aspect · Drainage · Erosion · High and low points</w:t>
+        <w:t>Soil · Water · Existing vegetation · Wildlife · Structures · Access and movement · Human use</w:t>
       </w:r>
     </w:p>
     <w:p>
@@ -784,7 +709,7 @@
         <w:t xml:space="preserve">Look for  </w:t>
       </w:r>
       <w:r>
-        <w:t>High and low points, contours, runoff paths, pooling, erosion, stable ground, aspect and difficult access.</w:t>
+        <w:t>Shelter, movement, competing uses, existing care, disturbed ground, habitat and places where life is already thriving.</w:t>
       </w:r>
     </w:p>
     <w:p>
@@ -798,7 +723,7 @@
         <w:t xml:space="preserve">Ask  </w:t>
       </w:r>
       <w:r>
-        <w:t>Where would water, people, seeds and roots naturally travel if no path or drain had been built?</w:t>
+        <w:t>What relationship becomes visible when this place is read as a connected system instead of separate objects?</w:t>
       </w:r>
     </w:p>
     <w:p>
@@ -812,7 +737,7 @@
         <w:t xml:space="preserve">Next  </w:t>
       </w:r>
       <w:r>
-        <w:t>Connect Topography with Water, then bring the result into Landscape and Strategy.</w:t>
+        <w:t>Connect Landscape with Design, then use Strategy to decide what deserves closer observation.</w:t>
       </w:r>
     </w:p>
     <w:p>
@@ -826,7 +751,7 @@
         <w:t xml:space="preserve">Connect  </w:t>
       </w:r>
       <w:r>
-        <w:t>Water</w:t>
+        <w:t>Design</w:t>
       </w:r>
     </w:p>
     <w:p>
@@ -847,7 +772,7 @@
         <w:pStyle w:val="Heading3"/>
       </w:pPr>
       <w:r>
-        <w:t>Landscape</w:t>
+        <w:t>Strategy</w:t>
       </w:r>
     </w:p>
     <w:p>
@@ -860,12 +785,12 @@
           <w:color w:val="505050"/>
           <w:sz w:val="18"/>
         </w:rPr>
-        <w:t>Stable ID  lim-intro-analysis-landscape    Parent ID  lim-intro-analysis</w:t>
-      </w:r>
-    </w:p>
-    <w:p>
-      <w:r>
-        <w:t>Landscape brings landform, soil, water, vegetation, wildlife, built elements and people into one view. Read their relationships before isolating a single feature; the most useful pattern is often found at an edge, transition or point of repeated use.</w:t>
+        <w:t>Stable ID  lim-intro-analysis-strategy    Parent ID  lim-intro-analysis</w:t>
+      </w:r>
+    </w:p>
+    <w:p>
+      <w:r>
+        <w:t>Strategy connects what a place is now with careful next steps. It turns opportunities, constraints and unanswered questions into priorities, zones and reversible actions, while a baseline gives later observations something honest to compare against.</w:t>
       </w:r>
     </w:p>
     <w:p>
@@ -879,7 +804,7 @@
         <w:t xml:space="preserve">Explore  </w:t>
       </w:r>
       <w:r>
-        <w:t>Soil · Water · Existing vegetation · Wildlife · Structures · Access and movement · Human use</w:t>
+        <w:t>Opportunities · Constraints · Questions · Zones · Priorities · Baseline observations · Further investigation</w:t>
       </w:r>
     </w:p>
     <w:p>
@@ -893,7 +818,7 @@
         <w:t xml:space="preserve">Look for  </w:t>
       </w:r>
       <w:r>
-        <w:t>Shelter, movement, competing uses, existing care, disturbed ground, habitat and places where life is already thriving.</w:t>
+        <w:t>The smallest useful action, the evidence behind it, the care available and the condition that would make the plan change.</w:t>
       </w:r>
     </w:p>
     <w:p>
@@ -907,7 +832,7 @@
         <w:t xml:space="preserve">Ask  </w:t>
       </w:r>
       <w:r>
-        <w:t>What relationship becomes visible when this place is read as a connected system instead of separate objects?</w:t>
+        <w:t>What would you try first, how would you know whether it helped, and when should the decision be reviewed?</w:t>
       </w:r>
     </w:p>
     <w:p>
@@ -921,7 +846,7 @@
         <w:t xml:space="preserve">Next  </w:t>
       </w:r>
       <w:r>
-        <w:t>Connect Landscape with Design, then use Strategy to decide what deserves closer observation.</w:t>
+        <w:t>Connect Strategy with Goals, Limitations and Challenges before moving into action.</w:t>
       </w:r>
     </w:p>
     <w:p>
@@ -935,7 +860,7 @@
         <w:t xml:space="preserve">Connect  </w:t>
       </w:r>
       <w:r>
-        <w:t>Design</w:t>
+        <w:t>Goals · Limitations · Challenges</w:t>
       </w:r>
     </w:p>
     <w:p>
@@ -953,10 +878,10 @@
     </w:p>
     <w:p>
       <w:pPr>
-        <w:pStyle w:val="Heading3"/>
-      </w:pPr>
-      <w:r>
-        <w:t>Strategy</w:t>
+        <w:pStyle w:val="Heading2"/>
+      </w:pPr>
+      <w:r>
+        <w:t>Understand the Land</w:t>
       </w:r>
     </w:p>
     <w:p>
@@ -969,12 +894,12 @@
           <w:color w:val="505050"/>
           <w:sz w:val="18"/>
         </w:rPr>
-        <w:t>Stable ID  lim-intro-analysis-strategy    Parent ID  lim-intro-analysis</w:t>
-      </w:r>
-    </w:p>
-    <w:p>
-      <w:r>
-        <w:t>Strategy connects what a place is now with careful next steps. It turns opportunities, constraints and unanswered questions into priorities, zones and reversible actions, while a baseline gives later observations something honest to compare against.</w:t>
+        <w:t>Stable ID  lim-intro-literacy    Parent ID  none</w:t>
+      </w:r>
+    </w:p>
+    <w:p>
+      <w:r>
+        <w:t>Understand the Land builds the ability to read organisms and their relationships. Plant identity, guilds, growth, harvest, soil life and wildlife become a practical language for exploring a place while keeping direct observation separate from assumption.</w:t>
       </w:r>
     </w:p>
     <w:p>
@@ -988,7 +913,7 @@
         <w:t xml:space="preserve">Explore  </w:t>
       </w:r>
       <w:r>
-        <w:t>Opportunities · Constraints · Questions · Zones · Priorities · Baseline observations · Further investigation</w:t>
+        <w:t>Plants · Guilds · Grow · Fruit · Soil life · Wildlife</w:t>
       </w:r>
     </w:p>
     <w:p>
@@ -1002,7 +927,7 @@
         <w:t xml:space="preserve">Look for  </w:t>
       </w:r>
       <w:r>
-        <w:t>The smallest useful action, the evidence behind it, the care available and the condition that would make the plan change.</w:t>
+        <w:t>Form, life cycle, neighbours, root conditions, seasonal visitors, signs of stress and signs of support.</w:t>
       </w:r>
     </w:p>
     <w:p>
@@ -1016,7 +941,7 @@
         <w:t xml:space="preserve">Ask  </w:t>
       </w:r>
       <w:r>
-        <w:t>What would you try first, how would you know whether it helped, and when should the decision be reviewed?</w:t>
+        <w:t>What can be described directly, what is inferred from a relationship, and what still needs another observation?</w:t>
       </w:r>
     </w:p>
     <w:p>
@@ -1030,21 +955,7 @@
         <w:t xml:space="preserve">Next  </w:t>
       </w:r>
       <w:r>
-        <w:t>Connect Strategy with Goals, Limitations and Challenges before moving into action.</w:t>
-      </w:r>
-    </w:p>
-    <w:p>
-      <w:pPr>
-        <w:spacing w:after="80"/>
-      </w:pPr>
-      <w:r>
-        <w:rPr>
-          <w:b/>
-        </w:rPr>
-        <w:t xml:space="preserve">Connect  </w:t>
-      </w:r>
-      <w:r>
-        <w:t>Goals · Limitations · Challenges</w:t>
+        <w:t>Choose one living subject, then follow its needs and relationships rather than stopping at its name.</w:t>
       </w:r>
     </w:p>
     <w:p>
@@ -1062,10 +973,10 @@
     </w:p>
     <w:p>
       <w:pPr>
-        <w:pStyle w:val="Heading2"/>
-      </w:pPr>
-      <w:r>
-        <w:t>Understand Life</w:t>
+        <w:pStyle w:val="Heading3"/>
+      </w:pPr>
+      <w:r>
+        <w:t>Plants</w:t>
       </w:r>
     </w:p>
     <w:p>
@@ -1078,12 +989,12 @@
           <w:color w:val="505050"/>
           <w:sz w:val="18"/>
         </w:rPr>
-        <w:t>Stable ID  lim-intro-literacy    Parent ID  lim-intro-vision</w:t>
-      </w:r>
-    </w:p>
-    <w:p>
-      <w:r>
-        <w:t>Understand Life builds the ability to read organisms and their relationships. Plant identity, guilds, growth, harvest, soil life and wildlife become a practical language for exploring a place while keeping direct observation separate from assumption.</w:t>
+        <w:t>Stable ID  lim-intro-literacy-plants    Parent ID  lim-intro-literacy</w:t>
+      </w:r>
+    </w:p>
+    <w:p>
+      <w:r>
+        <w:t>Plants can be read through identity, growth form, life cycle, needs and ecological roles. Begin with observable features and keep uncertainty visible; a careful “not sure yet” protects every later claim about care, use or relationships.</w:t>
       </w:r>
     </w:p>
     <w:p>
@@ -1097,7 +1008,7 @@
         <w:t xml:space="preserve">Explore  </w:t>
       </w:r>
       <w:r>
-        <w:t>Plants · Guilds · Grow · Fruit · Soil life · Wildlife</w:t>
+        <w:t>Identity · Growth form · Life cycle · Needs · Ecological roles</w:t>
       </w:r>
     </w:p>
     <w:p>
@@ -1111,7 +1022,7 @@
         <w:t xml:space="preserve">Look for  </w:t>
       </w:r>
       <w:r>
-        <w:t>Form, life cycle, neighbours, root conditions, seasonal visitors, signs of stress and signs of support.</w:t>
+        <w:t>Leaves, stems, bark, branching, roots, scale, season, health and features that distinguish similar species.</w:t>
       </w:r>
     </w:p>
     <w:p>
@@ -1125,7 +1036,7 @@
         <w:t xml:space="preserve">Ask  </w:t>
       </w:r>
       <w:r>
-        <w:t>What can be described directly, what is inferred from a relationship, and what still needs another observation?</w:t>
+        <w:t>Which feature would another observer need in order to check the identification and understand the plant in this place?</w:t>
       </w:r>
     </w:p>
     <w:p>
@@ -1139,7 +1050,21 @@
         <w:t xml:space="preserve">Next  </w:t>
       </w:r>
       <w:r>
-        <w:t>Choose one living subject, then follow its needs and relationships rather than stopping at its name.</w:t>
+        <w:t>Connect Plants with Climate, Guilds and Grow rather than treating a name as the end of the inquiry.</w:t>
+      </w:r>
+    </w:p>
+    <w:p>
+      <w:pPr>
+        <w:spacing w:after="80"/>
+      </w:pPr>
+      <w:r>
+        <w:rPr>
+          <w:b/>
+        </w:rPr>
+        <w:t xml:space="preserve">Connect  </w:t>
+      </w:r>
+      <w:r>
+        <w:t>Climate</w:t>
       </w:r>
     </w:p>
     <w:p>
@@ -1160,7 +1085,7 @@
         <w:pStyle w:val="Heading3"/>
       </w:pPr>
       <w:r>
-        <w:t>Plants</w:t>
+        <w:t>Guilds</w:t>
       </w:r>
     </w:p>
     <w:p>
@@ -1173,12 +1098,12 @@
           <w:color w:val="505050"/>
           <w:sz w:val="18"/>
         </w:rPr>
-        <w:t>Stable ID  lim-intro-literacy-plants    Parent ID  lim-intro-literacy</w:t>
-      </w:r>
-    </w:p>
-    <w:p>
-      <w:r>
-        <w:t>Plants can be read through identity, growth form, life cycle, needs and ecological roles. Begin with observable features and keep uncertainty visible; a careful “not sure yet” protects every later claim about care, use or relationships.</w:t>
+        <w:t>Stable ID  lim-intro-literacy-guilds    Parent ID  lim-intro-literacy</w:t>
+      </w:r>
+    </w:p>
+    <w:p>
+      <w:r>
+        <w:t>A guild explores organisms that may support shared functions such as food, shade, habitat, pollination or fertility. It is a testable idea about relationships, not a promise that every companion will cooperate in every place or season.</w:t>
       </w:r>
     </w:p>
     <w:p>
@@ -1192,7 +1117,7 @@
         <w:t xml:space="preserve">Explore  </w:t>
       </w:r>
       <w:r>
-        <w:t>Identity · Growth form · Life cycle · Needs · Ecological roles</w:t>
+        <w:t>Companions · Support species · Shared resources · Competition · Pollination · Fertility · Mutual relationships</w:t>
       </w:r>
     </w:p>
     <w:p>
@@ -1206,7 +1131,7 @@
         <w:t xml:space="preserve">Look for  </w:t>
       </w:r>
       <w:r>
-        <w:t>Leaves, stems, bark, branching, roots, scale, season, health and features that distinguish similar species.</w:t>
+        <w:t>Flowering times, root zones, shared resources, competition, habitat, fertility and the people who will maintain the planting.</w:t>
       </w:r>
     </w:p>
     <w:p>
@@ -1220,7 +1145,7 @@
         <w:t xml:space="preserve">Ask  </w:t>
       </w:r>
       <w:r>
-        <w:t>Which feature would another observer need in order to check the identification and understand the plant in this place?</w:t>
+        <w:t>Which relationship has been observed here, which is still a design hypothesis, and what evidence would distinguish them?</w:t>
       </w:r>
     </w:p>
     <w:p>
@@ -1234,7 +1159,7 @@
         <w:t xml:space="preserve">Next  </w:t>
       </w:r>
       <w:r>
-        <w:t>Connect Plants with Climate, Guilds and Grow rather than treating a name as the end of the inquiry.</w:t>
+        <w:t>Connect Guilds with Function to test whether the proposed relationships are doing useful work.</w:t>
       </w:r>
     </w:p>
     <w:p>
@@ -1248,7 +1173,7 @@
         <w:t xml:space="preserve">Connect  </w:t>
       </w:r>
       <w:r>
-        <w:t>Climate</w:t>
+        <w:t>Function</w:t>
       </w:r>
     </w:p>
     <w:p>
@@ -1269,7 +1194,7 @@
         <w:pStyle w:val="Heading3"/>
       </w:pPr>
       <w:r>
-        <w:t>Guilds</w:t>
+        <w:t>Grow</w:t>
       </w:r>
     </w:p>
     <w:p>
@@ -1282,12 +1207,12 @@
           <w:color w:val="505050"/>
           <w:sz w:val="18"/>
         </w:rPr>
-        <w:t>Stable ID  lim-intro-literacy-guilds    Parent ID  lim-intro-literacy</w:t>
-      </w:r>
-    </w:p>
-    <w:p>
-      <w:r>
-        <w:t>A guild explores organisms that may support shared functions such as food, shade, habitat, pollination or fertility. It is a testable idea about relationships, not a promise that every companion will cooperate in every place or season.</w:t>
+        <w:t>Stable ID  lim-intro-literacy-grow    Parent ID  lim-intro-literacy</w:t>
+      </w:r>
+    </w:p>
+    <w:p>
+      <w:r>
+        <w:t>Growing knowledge joins propagation, establishment, water, nutrition, pruning, health and seasonal care. The method should suit the species, place and people caring for it; a technically possible method can still be a poor local choice.</w:t>
       </w:r>
     </w:p>
     <w:p>
@@ -1301,7 +1226,7 @@
         <w:t xml:space="preserve">Explore  </w:t>
       </w:r>
       <w:r>
-        <w:t>Companions · Support species · Shared resources · Competition · Pollination · Fertility · Mutual relationships</w:t>
+        <w:t>Propagation · Establishment · Watering · Feeding · Pruning · Health · Pests · Seasonal care</w:t>
       </w:r>
     </w:p>
     <w:p>
@@ -1315,7 +1240,7 @@
         <w:t xml:space="preserve">Look for  </w:t>
       </w:r>
       <w:r>
-        <w:t>Flowering times, root zones, shared resources, competition, habitat, fertility and the people who will maintain the planting.</w:t>
+        <w:t>Roots, new growth, water stress, protection, timing, pests, failure points and the care that is realistically available.</w:t>
       </w:r>
     </w:p>
     <w:p>
@@ -1329,7 +1254,7 @@
         <w:t xml:space="preserve">Ask  </w:t>
       </w:r>
       <w:r>
-        <w:t>Which relationship has been observed here, which is still a design hypothesis, and what evidence would distinguish them?</w:t>
+        <w:t>What does this plant need during its current life stage, and who will notice if that need changes or is missed?</w:t>
       </w:r>
     </w:p>
     <w:p>
@@ -1343,7 +1268,7 @@
         <w:t xml:space="preserve">Next  </w:t>
       </w:r>
       <w:r>
-        <w:t>Connect Guilds with Function to test whether the proposed relationships are doing useful work.</w:t>
+        <w:t>Connect Grow with Succession to plan for establishment, maturity and changing care.</w:t>
       </w:r>
     </w:p>
     <w:p>
@@ -1357,7 +1282,7 @@
         <w:t xml:space="preserve">Connect  </w:t>
       </w:r>
       <w:r>
-        <w:t>Function</w:t>
+        <w:t>Succession</w:t>
       </w:r>
     </w:p>
     <w:p>
@@ -1378,7 +1303,7 @@
         <w:pStyle w:val="Heading3"/>
       </w:pPr>
       <w:r>
-        <w:t>Grow</w:t>
+        <w:t>Fruit</w:t>
       </w:r>
     </w:p>
     <w:p>
@@ -1391,12 +1316,12 @@
           <w:color w:val="505050"/>
           <w:sz w:val="18"/>
         </w:rPr>
-        <w:t>Stable ID  lim-intro-literacy-grow    Parent ID  lim-intro-literacy</w:t>
-      </w:r>
-    </w:p>
-    <w:p>
-      <w:r>
-        <w:t>Growing knowledge joins propagation, establishment, water, nutrition, pruning, health and seasonal care. The method should suit the species, place and people caring for it; a technically possible method can still be a poor local choice.</w:t>
+        <w:t>Stable ID  lim-intro-literacy-fruit    Parent ID  lim-intro-literacy</w:t>
+      </w:r>
+    </w:p>
+    <w:p>
+      <w:r>
+        <w:t>Fruit connects plant identity with flowering, pollination, season, ripeness, harvest, preparation and safe use. A harvest is also evidence of how a plant responds to its place, so timing and conditions matter more than a fixed promise of yield.</w:t>
       </w:r>
     </w:p>
     <w:p>
@@ -1410,7 +1335,7 @@
         <w:t xml:space="preserve">Explore  </w:t>
       </w:r>
       <w:r>
-        <w:t>Propagation · Establishment · Watering · Feeding · Pruning · Health · Pests · Seasonal care</w:t>
+        <w:t>Edible parts · Flowering · Season · Ripeness · Harvest · Preparation · Safety · Storage and sharing</w:t>
       </w:r>
     </w:p>
     <w:p>
@@ -1424,7 +1349,7 @@
         <w:t xml:space="preserve">Look for  </w:t>
       </w:r>
       <w:r>
-        <w:t>Roots, new growth, water stress, protection, timing, pests, failure points and the care that is realistically available.</w:t>
+        <w:t>Flowers, pollinators, fruit set, ripeness cues, damage, edible parts, harvest method and what remains for wildlife.</w:t>
       </w:r>
     </w:p>
     <w:p>
@@ -1438,7 +1363,7 @@
         <w:t xml:space="preserve">Ask  </w:t>
       </w:r>
       <w:r>
-        <w:t>What does this plant need during its current life stage, and who will notice if that need changes or is missed?</w:t>
+        <w:t>What changed between flowering and harvest, and what evidence is needed before describing an edible use as safe?</w:t>
       </w:r>
     </w:p>
     <w:p>
@@ -1452,7 +1377,7 @@
         <w:t xml:space="preserve">Next  </w:t>
       </w:r>
       <w:r>
-        <w:t>Connect Grow with Succession to plan for establishment, maturity and changing care.</w:t>
+        <w:t>Connect Fruit with Outcomes, then record preparation knowledge with its source and local context.</w:t>
       </w:r>
     </w:p>
     <w:p>
@@ -1466,7 +1391,7 @@
         <w:t xml:space="preserve">Connect  </w:t>
       </w:r>
       <w:r>
-        <w:t>Succession</w:t>
+        <w:t>Outcomes</w:t>
       </w:r>
     </w:p>
     <w:p>
@@ -1487,7 +1412,7 @@
         <w:pStyle w:val="Heading3"/>
       </w:pPr>
       <w:r>
-        <w:t>Fruit</w:t>
+        <w:t>Soil Life</w:t>
       </w:r>
     </w:p>
     <w:p>
@@ -1500,12 +1425,12 @@
           <w:color w:val="505050"/>
           <w:sz w:val="18"/>
         </w:rPr>
-        <w:t>Stable ID  lim-intro-literacy-fruit    Parent ID  lim-intro-literacy</w:t>
-      </w:r>
-    </w:p>
-    <w:p>
-      <w:r>
-        <w:t>Fruit connects plant identity with flowering, pollination, season, ripeness, harvest, preparation and safe use. A harvest is also evidence of how a plant responds to its place, so timing and conditions matter more than a fixed promise of yield.</w:t>
+        <w:t>Stable ID  lim-intro-literacy-soil-life    Parent ID  lim-intro-literacy</w:t>
+      </w:r>
+    </w:p>
+    <w:p>
+      <w:r>
+        <w:t>Soil life includes fungi, bacteria, decomposers, roots and other organisms that transform organic matter and shape soil structure. Their activity cannot be reduced to a single fertility score; moisture, air, disturbance and living roots all affect the system.</w:t>
       </w:r>
     </w:p>
     <w:p>
@@ -1519,7 +1444,7 @@
         <w:t xml:space="preserve">Explore  </w:t>
       </w:r>
       <w:r>
-        <w:t>Edible parts · Flowering · Season · Ripeness · Harvest · Preparation · Safety · Storage and sharing</w:t>
+        <w:t>Soil structure · Organic matter · Fungi · Bacteria · Decomposers · Nutrient cycling · Root zone</w:t>
       </w:r>
     </w:p>
     <w:p>
@@ -1533,7 +1458,7 @@
         <w:t xml:space="preserve">Look for  </w:t>
       </w:r>
       <w:r>
-        <w:t>Flowers, pollinators, fruit set, ripeness cues, damage, edible parts, harvest method and what remains for wildlife.</w:t>
+        <w:t>Aggregation, pores, roots, litter, fungi, invertebrates, smell, moisture and the speed at which organic material changes.</w:t>
       </w:r>
     </w:p>
     <w:p>
@@ -1547,7 +1472,7 @@
         <w:t xml:space="preserve">Ask  </w:t>
       </w:r>
       <w:r>
-        <w:t>What changed between flowering and harvest, and what evidence is needed before describing an edible use as safe?</w:t>
+        <w:t>What direct signs suggest an active soil community, and which claims would require sampling or longer observation?</w:t>
       </w:r>
     </w:p>
     <w:p>
@@ -1561,7 +1486,7 @@
         <w:t xml:space="preserve">Next  </w:t>
       </w:r>
       <w:r>
-        <w:t>Connect Fruit with Outcomes, then record preparation knowledge with its source and local context.</w:t>
+        <w:t>Connect Soil Life with Energy to follow how organic matter and nutrients move through the forest.</w:t>
       </w:r>
     </w:p>
     <w:p>
@@ -1575,7 +1500,7 @@
         <w:t xml:space="preserve">Connect  </w:t>
       </w:r>
       <w:r>
-        <w:t>Outcomes</w:t>
+        <w:t>Energy</w:t>
       </w:r>
     </w:p>
     <w:p>
@@ -1596,7 +1521,7 @@
         <w:pStyle w:val="Heading3"/>
       </w:pPr>
       <w:r>
-        <w:t>Soil Life</w:t>
+        <w:t>Wildlife</w:t>
       </w:r>
     </w:p>
     <w:p>
@@ -1609,12 +1534,12 @@
           <w:color w:val="505050"/>
           <w:sz w:val="18"/>
         </w:rPr>
-        <w:t>Stable ID  lim-intro-literacy-soil-life    Parent ID  lim-intro-literacy</w:t>
-      </w:r>
-    </w:p>
-    <w:p>
-      <w:r>
-        <w:t>Soil life includes fungi, bacteria, decomposers, roots and other organisms that transform organic matter and shape soil structure. Their activity cannot be reduced to a single fertility score; moisture, air, disturbance and living roots all affect the system.</w:t>
+        <w:t>Stable ID  lim-intro-literacy-wildlife    Parent ID  lim-intro-literacy</w:t>
+      </w:r>
+    </w:p>
+    <w:p>
+      <w:r>
+        <w:t>Wildlife reveals how birds, insects, mammals and other animals use a place for food, shelter, nesting, movement and reproduction. An interaction may help one participant and challenge another, so observation should record behaviour before assigning a simple benefit or harm.</w:t>
       </w:r>
     </w:p>
     <w:p>
@@ -1628,7 +1553,7 @@
         <w:t xml:space="preserve">Explore  </w:t>
       </w:r>
       <w:r>
-        <w:t>Soil structure · Organic matter · Fungi · Bacteria · Decomposers · Nutrient cycling · Root zone</w:t>
+        <w:t>Habitat · Pollinators · Predators · Seed dispersers · Nesting · Seasonal presence · Conflict</w:t>
       </w:r>
     </w:p>
     <w:p>
@@ -1642,7 +1567,7 @@
         <w:t xml:space="preserve">Look for  </w:t>
       </w:r>
       <w:r>
-        <w:t>Aggregation, pores, roots, litter, fungi, invertebrates, smell, moisture and the speed at which organic material changes.</w:t>
+        <w:t>Tracks, calls, nests, feeding, pollination, dispersal, predation, seasonal arrival and repeated movement routes.</w:t>
       </w:r>
     </w:p>
     <w:p>
@@ -1656,7 +1581,7 @@
         <w:t xml:space="preserve">Ask  </w:t>
       </w:r>
       <w:r>
-        <w:t>What direct signs suggest an active soil community, and which claims would require sampling or longer observation?</w:t>
+        <w:t>Who is present, what are they doing, when does it happen, and how confident is the interpretation?</w:t>
       </w:r>
     </w:p>
     <w:p>
@@ -1670,7 +1595,7 @@
         <w:t xml:space="preserve">Next  </w:t>
       </w:r>
       <w:r>
-        <w:t>Connect Soil Life with Energy to follow how organic matter and nutrients move through the forest.</w:t>
+        <w:t>Connect Wildlife with Stewardship so habitat, harvest and conflict can be managed together.</w:t>
       </w:r>
     </w:p>
     <w:p>
@@ -1684,7 +1609,7 @@
         <w:t xml:space="preserve">Connect  </w:t>
       </w:r>
       <w:r>
-        <w:t>Energy</w:t>
+        <w:t>Stewardship</w:t>
       </w:r>
     </w:p>
     <w:p>
@@ -1702,10 +1627,10 @@
     </w:p>
     <w:p>
       <w:pPr>
-        <w:pStyle w:val="Heading3"/>
-      </w:pPr>
-      <w:r>
-        <w:t>Wildlife</w:t>
+        <w:pStyle w:val="Heading2"/>
+      </w:pPr>
+      <w:r>
+        <w:t>Design the Forest</w:t>
       </w:r>
     </w:p>
     <w:p>
@@ -1718,12 +1643,12 @@
           <w:color w:val="505050"/>
           <w:sz w:val="18"/>
         </w:rPr>
-        <w:t>Stable ID  lim-intro-literacy-wildlife    Parent ID  lim-intro-literacy</w:t>
-      </w:r>
-    </w:p>
-    <w:p>
-      <w:r>
-        <w:t>Wildlife reveals how birds, insects, mammals and other animals use a place for food, shelter, nesting, movement and reproduction. An interaction may help one participant and challenge another, so observation should record behaviour before assigning a simple benefit or harm.</w:t>
+        <w:t>Stable ID  lim-intro-food-forest    Parent ID  none</w:t>
+      </w:r>
+    </w:p>
+    <w:p>
+      <w:r>
+        <w:t>Design the Forest uses ecological patterns to create productive living landscapes. Function, flows, spatial design, succession, water and stewardship guide decisions while observation keeps them grounded in place; the model is a prompt for thinking, not a rigid recipe.</w:t>
       </w:r>
     </w:p>
     <w:p>
@@ -1737,7 +1662,7 @@
         <w:t xml:space="preserve">Explore  </w:t>
       </w:r>
       <w:r>
-        <w:t>Habitat · Pollinators · Predators · Seed dispersers · Nesting · Seasonal presence · Conflict</w:t>
+        <w:t>Function · Energy · Design · Succession · Water · Stewardship</w:t>
       </w:r>
     </w:p>
     <w:p>
@@ -1751,7 +1676,7 @@
         <w:t xml:space="preserve">Look for  </w:t>
       </w:r>
       <w:r>
-        <w:t>Tracks, calls, nests, feeding, pollination, dispersal, predation, seasonal arrival and repeated movement routes.</w:t>
+        <w:t>Layers, relationships, water, access, maintenance, seasonal change and places where one element performs several useful roles.</w:t>
       </w:r>
     </w:p>
     <w:p>
@@ -1765,7 +1690,7 @@
         <w:t xml:space="preserve">Ask  </w:t>
       </w:r>
       <w:r>
-        <w:t>Who is present, what are they doing, when does it happen, and how confident is the interpretation?</w:t>
+        <w:t>Which function or relationship is missing, overloaded or likely to change as the living system matures?</w:t>
       </w:r>
     </w:p>
     <w:p>
@@ -1779,21 +1704,7 @@
         <w:t xml:space="preserve">Next  </w:t>
       </w:r>
       <w:r>
-        <w:t>Connect Wildlife with Stewardship so habitat, harvest and conflict can be managed together.</w:t>
-      </w:r>
-    </w:p>
-    <w:p>
-      <w:pPr>
-        <w:spacing w:after="80"/>
-      </w:pPr>
-      <w:r>
-        <w:rPr>
-          <w:b/>
-        </w:rPr>
-        <w:t xml:space="preserve">Connect  </w:t>
-      </w:r>
-      <w:r>
-        <w:t>Stewardship</w:t>
+        <w:t>Choose a design lens, test it against the place, and leave a clear path back to observation.</w:t>
       </w:r>
     </w:p>
     <w:p>
@@ -1811,10 +1722,10 @@
     </w:p>
     <w:p>
       <w:pPr>
-        <w:pStyle w:val="Heading2"/>
-      </w:pPr>
-      <w:r>
-        <w:t>Design the Forest</w:t>
+        <w:pStyle w:val="Heading3"/>
+      </w:pPr>
+      <w:r>
+        <w:t>Function</w:t>
       </w:r>
     </w:p>
     <w:p>
@@ -1827,12 +1738,12 @@
           <w:color w:val="505050"/>
           <w:sz w:val="18"/>
         </w:rPr>
-        <w:t>Stable ID  lim-intro-food-forest    Parent ID  lim-intro-vision</w:t>
-      </w:r>
-    </w:p>
-    <w:p>
-      <w:r>
-        <w:t>Design the Forest uses ecological patterns to create productive living landscapes. Function, flows, spatial design, succession, water and stewardship guide decisions while observation keeps them grounded in place; the model is a prompt for thinking, not a rigid recipe.</w:t>
+        <w:t>Stable ID  lim-intro-food-function    Parent ID  lim-intro-food-forest</w:t>
+      </w:r>
+    </w:p>
+    <w:p>
+      <w:r>
+        <w:t>Function asks what each element contributes: food, shade, habitat, shelter, access, fertility or another role. One element may perform several functions, and a function only matters if it works for this place and the people maintaining it.</w:t>
       </w:r>
     </w:p>
     <w:p>
@@ -1846,7 +1757,7 @@
         <w:t xml:space="preserve">Explore  </w:t>
       </w:r>
       <w:r>
-        <w:t>Function · Energy · Design · Succession · Water · Stewardship</w:t>
+        <w:t>Food and yield · Habitat · Shade and shelter · Fertility · Access · Multiple functions</w:t>
       </w:r>
     </w:p>
     <w:p>
@@ -1860,7 +1771,7 @@
         <w:t xml:space="preserve">Look for  </w:t>
       </w:r>
       <w:r>
-        <w:t>Layers, relationships, water, access, maintenance, seasonal change and places where one element performs several useful roles.</w:t>
+        <w:t>Outputs, support roles, maintenance burden, seasonal gaps and useful overlaps between plants, structures and human activity.</w:t>
       </w:r>
     </w:p>
     <w:p>
@@ -1874,7 +1785,7 @@
         <w:t xml:space="preserve">Ask  </w:t>
       </w:r>
       <w:r>
-        <w:t>Which function or relationship is missing, overloaded or likely to change as the living system matures?</w:t>
+        <w:t>What job is this element doing, and what direct evidence shows that the job is being done?</w:t>
       </w:r>
     </w:p>
     <w:p>
@@ -1888,7 +1799,21 @@
         <w:t xml:space="preserve">Next  </w:t>
       </w:r>
       <w:r>
-        <w:t>Choose a design lens, test it against the place, and leave a clear path back to observation.</w:t>
+        <w:t>Connect Function with Guilds, then use Energy and Design to place useful relationships well.</w:t>
+      </w:r>
+    </w:p>
+    <w:p>
+      <w:pPr>
+        <w:spacing w:after="80"/>
+      </w:pPr>
+      <w:r>
+        <w:rPr>
+          <w:b/>
+        </w:rPr>
+        <w:t xml:space="preserve">Connect  </w:t>
+      </w:r>
+      <w:r>
+        <w:t>Guilds</w:t>
       </w:r>
     </w:p>
     <w:p>
@@ -1909,7 +1834,7 @@
         <w:pStyle w:val="Heading3"/>
       </w:pPr>
       <w:r>
-        <w:t>Function</w:t>
+        <w:t>Energy</w:t>
       </w:r>
     </w:p>
     <w:p>
@@ -1922,12 +1847,12 @@
           <w:color w:val="505050"/>
           <w:sz w:val="18"/>
         </w:rPr>
-        <w:t>Stable ID  lim-intro-food-function    Parent ID  lim-intro-food-forest</w:t>
-      </w:r>
-    </w:p>
-    <w:p>
-      <w:r>
-        <w:t>Function asks what each element contributes: food, shade, habitat, shelter, access, fertility or another role. One element may perform several functions, and a function only matters if it works for this place and the people maintaining it.</w:t>
+        <w:t>Stable ID  lim-intro-food-energy    Parent ID  lim-intro-food-forest</w:t>
+      </w:r>
+    </w:p>
+    <w:p>
+      <w:r>
+        <w:t>Sunlight, water, wind, organic matter and human effort move through a food forest. Good design notices where these flows arrive, where they are stored and where they are lost, then reduces needless work without pretending that care can disappear.</w:t>
       </w:r>
     </w:p>
     <w:p>
@@ -1941,7 +1866,7 @@
         <w:t xml:space="preserve">Explore  </w:t>
       </w:r>
       <w:r>
-        <w:t>Food and yield · Habitat · Shade and shelter · Fertility · Access · Multiple functions</w:t>
+        <w:t>Sunlight · Water flow · Wind · Organic matter · Human work · Storage and loss</w:t>
       </w:r>
     </w:p>
     <w:p>
@@ -1955,7 +1880,7 @@
         <w:t xml:space="preserve">Look for  </w:t>
       </w:r>
       <w:r>
-        <w:t>Outputs, support roles, maintenance burden, seasonal gaps and useful overlaps between plants, structures and human activity.</w:t>
+        <w:t>Sun paths, shade, runoff, wind, mulch, nutrient cycles, tool access and tasks that must be repeated.</w:t>
       </w:r>
     </w:p>
     <w:p>
@@ -1969,7 +1894,7 @@
         <w:t xml:space="preserve">Ask  </w:t>
       </w:r>
       <w:r>
-        <w:t>What job is this element doing, and what direct evidence shows that the job is being done?</w:t>
+        <w:t>Where is useful energy being lost, and where could a living relationship capture, store or redirect it?</w:t>
       </w:r>
     </w:p>
     <w:p>
@@ -1983,7 +1908,7 @@
         <w:t xml:space="preserve">Next  </w:t>
       </w:r>
       <w:r>
-        <w:t>Connect Function with Guilds, then use Energy and Design to place useful relationships well.</w:t>
+        <w:t>Connect Energy with Soil Life, then compare the result with Water, Design and Succession.</w:t>
       </w:r>
     </w:p>
     <w:p>
@@ -1997,7 +1922,7 @@
         <w:t xml:space="preserve">Connect  </w:t>
       </w:r>
       <w:r>
-        <w:t>Guilds</w:t>
+        <w:t>Soil Life</w:t>
       </w:r>
     </w:p>
     <w:p>
@@ -2018,7 +1943,7 @@
         <w:pStyle w:val="Heading3"/>
       </w:pPr>
       <w:r>
-        <w:t>Energy</w:t>
+        <w:t>Design</w:t>
       </w:r>
     </w:p>
     <w:p>
@@ -2031,12 +1956,12 @@
           <w:color w:val="505050"/>
           <w:sz w:val="18"/>
         </w:rPr>
-        <w:t>Stable ID  lim-intro-food-energy    Parent ID  lim-intro-food-forest</w:t>
-      </w:r>
-    </w:p>
-    <w:p>
-      <w:r>
-        <w:t>Sunlight, water, wind, organic matter and human effort move through a food forest. Good design notices where these flows arrive, where they are stored and where they are lost, then reduces needless work without pretending that care can disappear.</w:t>
+        <w:t>Stable ID  lim-intro-food-design    Parent ID  lim-intro-food-forest</w:t>
+      </w:r>
+    </w:p>
+    <w:p>
+      <w:r>
+        <w:t>Design arranges plants, paths, water and access around real goals and conditions. Layers, spacing, edges, zones and redundancy become useful only when people can safely reach, observe and care for the system as it changes.</w:t>
       </w:r>
     </w:p>
     <w:p>
@@ -2050,7 +1975,7 @@
         <w:t xml:space="preserve">Explore  </w:t>
       </w:r>
       <w:r>
-        <w:t>Sunlight · Water flow · Wind · Organic matter · Human work · Storage and loss</w:t>
+        <w:t>Layers · Spacing · Access · Edges · Zones · Redundancy · Maintenance</w:t>
       </w:r>
     </w:p>
     <w:p>
@@ -2064,7 +1989,7 @@
         <w:t xml:space="preserve">Look for  </w:t>
       </w:r>
       <w:r>
-        <w:t>Sun paths, shade, runoff, wind, mulch, nutrient cycles, tool access and tasks that must be repeated.</w:t>
+        <w:t>Scale, future canopy, access, safety, water, sight lines, maintenance routes and the consequences of mature size.</w:t>
       </w:r>
     </w:p>
     <w:p>
@@ -2078,7 +2003,7 @@
         <w:t xml:space="preserve">Ask  </w:t>
       </w:r>
       <w:r>
-        <w:t>Where is useful energy being lost, and where could a living relationship capture, store or redirect it?</w:t>
+        <w:t>What is the smallest design move that would improve function and make the next season easier to learn from?</w:t>
       </w:r>
     </w:p>
     <w:p>
@@ -2092,7 +2017,7 @@
         <w:t xml:space="preserve">Next  </w:t>
       </w:r>
       <w:r>
-        <w:t>Connect Energy with Soil Life, then compare the result with Water, Design and Succession.</w:t>
+        <w:t>Connect Design with Landscape, then test the choice against Stewardship and future Succession.</w:t>
       </w:r>
     </w:p>
     <w:p>
@@ -2106,7 +2031,7 @@
         <w:t xml:space="preserve">Connect  </w:t>
       </w:r>
       <w:r>
-        <w:t>Soil Life</w:t>
+        <w:t>Landscape</w:t>
       </w:r>
     </w:p>
     <w:p>
@@ -2127,7 +2052,7 @@
         <w:pStyle w:val="Heading3"/>
       </w:pPr>
       <w:r>
-        <w:t>Design</w:t>
+        <w:t>Succession</w:t>
       </w:r>
     </w:p>
     <w:p>
@@ -2140,12 +2065,12 @@
           <w:color w:val="505050"/>
           <w:sz w:val="18"/>
         </w:rPr>
-        <w:t>Stable ID  lim-intro-food-design    Parent ID  lim-intro-food-forest</w:t>
-      </w:r>
-    </w:p>
-    <w:p>
-      <w:r>
-        <w:t>Design arranges plants, paths, water and access around real goals and conditions. Layers, spacing, edges, zones and redundancy become useful only when people can safely reach, observe and care for the system as it changes.</w:t>
+        <w:t>Stable ID  lim-intro-food-succession    Parent ID  lim-intro-food-forest</w:t>
+      </w:r>
+    </w:p>
+    <w:p>
+      <w:r>
+        <w:t>Succession is change through time. Early plants can protect soil and prepare conditions for later ones, while a food forest shifts in shade, structure and care as it matures; planning for change prevents today’s solution becoming tomorrow’s obstacle.</w:t>
       </w:r>
     </w:p>
     <w:p>
@@ -2159,7 +2084,7 @@
         <w:t xml:space="preserve">Explore  </w:t>
       </w:r>
       <w:r>
-        <w:t>Layers · Spacing · Access · Edges · Zones · Redundancy · Maintenance</w:t>
+        <w:t>Pioneer species · Nurse plants · Canopy closure · Changing light · Replacement · Maturity</w:t>
       </w:r>
     </w:p>
     <w:p>
@@ -2173,7 +2098,7 @@
         <w:t xml:space="preserve">Look for  </w:t>
       </w:r>
       <w:r>
-        <w:t>Scale, future canopy, access, safety, water, sight lines, maintenance routes and the consequences of mature size.</w:t>
+        <w:t>Fast and slow growers, nurse plants, changing light, mortality, recruitment, replacement and changing maintenance needs.</w:t>
       </w:r>
     </w:p>
     <w:p>
@@ -2187,7 +2112,7 @@
         <w:t xml:space="preserve">Ask  </w:t>
       </w:r>
       <w:r>
-        <w:t>What is the smallest design move that would improve function and make the next season easier to learn from?</w:t>
+        <w:t>What is this planting preparing for, and what will need to change when roots, canopy and access mature?</w:t>
       </w:r>
     </w:p>
     <w:p>
@@ -2201,7 +2126,7 @@
         <w:t xml:space="preserve">Next  </w:t>
       </w:r>
       <w:r>
-        <w:t>Connect Design with Landscape, then test the choice against Stewardship and future Succession.</w:t>
+        <w:t>Connect Succession with Grow, then return to Outcomes and Feedback to make change visible.</w:t>
       </w:r>
     </w:p>
     <w:p>
@@ -2215,7 +2140,7 @@
         <w:t xml:space="preserve">Connect  </w:t>
       </w:r>
       <w:r>
-        <w:t>Landscape</w:t>
+        <w:t>Grow</w:t>
       </w:r>
     </w:p>
     <w:p>
@@ -2236,7 +2161,7 @@
         <w:pStyle w:val="Heading3"/>
       </w:pPr>
       <w:r>
-        <w:t>Succession</w:t>
+        <w:t>Water</w:t>
       </w:r>
     </w:p>
     <w:p>
@@ -2249,12 +2174,12 @@
           <w:color w:val="505050"/>
           <w:sz w:val="18"/>
         </w:rPr>
-        <w:t>Stable ID  lim-intro-food-succession    Parent ID  lim-intro-food-forest</w:t>
-      </w:r>
-    </w:p>
-    <w:p>
-      <w:r>
-        <w:t>Succession is change through time. Early plants can protect soil and prepare conditions for later ones, while a food forest shifts in shade, structure and care as it matures; planning for change prevents today’s solution becoming tomorrow’s obstacle.</w:t>
+        <w:t>Stable ID  lim-intro-food-water    Parent ID  lim-intro-food-forest</w:t>
+      </w:r>
+    </w:p>
+    <w:p>
+      <w:r>
+        <w:t>Water design follows rainfall, runoff, infiltration, storage, irrigation and safe overflow through the site. The aim is to slow, spread, sink or move water according to real conditions without creating erosion, waterlogging or an unrealistic maintenance burden.</w:t>
       </w:r>
     </w:p>
     <w:p>
@@ -2268,7 +2193,7 @@
         <w:t xml:space="preserve">Explore  </w:t>
       </w:r>
       <w:r>
-        <w:t>Pioneer species · Nurse plants · Canopy closure · Changing light · Replacement · Maturity</w:t>
+        <w:t>Source · Capture · Infiltration · Storage · Overflow · Irrigation · Drought and flood</w:t>
       </w:r>
     </w:p>
     <w:p>
@@ -2282,7 +2207,7 @@
         <w:t xml:space="preserve">Look for  </w:t>
       </w:r>
       <w:r>
-        <w:t>Fast and slow growers, nurse plants, changing light, mortality, recruitment, replacement and changing maintenance needs.</w:t>
+        <w:t>Sources, contours, compacted ground, pooling, dry zones, overflow routes, roof water and signs of erosion.</w:t>
       </w:r>
     </w:p>
     <w:p>
@@ -2296,7 +2221,7 @@
         <w:t xml:space="preserve">Ask  </w:t>
       </w:r>
       <w:r>
-        <w:t>What is this planting preparing for, and what will need to change when roots, canopy and access mature?</w:t>
+        <w:t>Where does water arrive, where can it safely pause, and where must it continue during an extreme event?</w:t>
       </w:r>
     </w:p>
     <w:p>
@@ -2310,7 +2235,7 @@
         <w:t xml:space="preserve">Next  </w:t>
       </w:r>
       <w:r>
-        <w:t>Connect Succession with Grow, then return to Outcomes and Feedback to make change visible.</w:t>
+        <w:t>Connect Water with Topography before choosing storage, planting or earthworks.</w:t>
       </w:r>
     </w:p>
     <w:p>
@@ -2324,7 +2249,7 @@
         <w:t xml:space="preserve">Connect  </w:t>
       </w:r>
       <w:r>
-        <w:t>Grow</w:t>
+        <w:t>Topography</w:t>
       </w:r>
     </w:p>
     <w:p>
@@ -2345,7 +2270,7 @@
         <w:pStyle w:val="Heading3"/>
       </w:pPr>
       <w:r>
-        <w:t>Water</w:t>
+        <w:t>Stewardship</w:t>
       </w:r>
     </w:p>
     <w:p>
@@ -2358,12 +2283,12 @@
           <w:color w:val="505050"/>
           <w:sz w:val="18"/>
         </w:rPr>
-        <w:t>Stable ID  lim-intro-food-water    Parent ID  lim-intro-food-forest</w:t>
-      </w:r>
-    </w:p>
-    <w:p>
-      <w:r>
-        <w:t>Water design follows rainfall, runoff, infiltration, storage, irrigation and safe overflow through the site. The aim is to slow, spread, sink or move water according to real conditions without creating erosion, waterlogging or an unrealistic maintenance burden.</w:t>
+        <w:t>Stable ID  lim-intro-food-stewardship    Parent ID  lim-intro-food-forest</w:t>
+      </w:r>
+    </w:p>
+    <w:p>
+      <w:r>
+        <w:t>Stewardship is the continuing work of observing, maintaining, harvesting and adapting a living system. It includes safety, shared responsibility and care for wildlife as well as plants; a design that nobody can maintain is incomplete.</w:t>
       </w:r>
     </w:p>
     <w:p>
@@ -2377,7 +2302,7 @@
         <w:t xml:space="preserve">Explore  </w:t>
       </w:r>
       <w:r>
-        <w:t>Source · Capture · Infiltration · Storage · Overflow · Irrigation · Drought and flood</w:t>
+        <w:t>Observation · Maintenance · Harvest · Pruning · Safety · Shared roles · Adaptation</w:t>
       </w:r>
     </w:p>
     <w:p>
@@ -2391,7 +2316,7 @@
         <w:t xml:space="preserve">Look for  </w:t>
       </w:r>
       <w:r>
-        <w:t>Sources, contours, compacted ground, pooling, dry zones, overflow routes, roof water and signs of erosion.</w:t>
+        <w:t>Who notices change, who has access, which tasks repeat, when intervention is needed and where care could cause unintended harm.</w:t>
       </w:r>
     </w:p>
     <w:p>
@@ -2405,7 +2330,7 @@
         <w:t xml:space="preserve">Ask  </w:t>
       </w:r>
       <w:r>
-        <w:t>Where does water arrive, where can it safely pause, and where must it continue during an extreme event?</w:t>
+        <w:t>What care does this place need next, who can provide it, and how will their observations return to the knowledge mesh?</w:t>
       </w:r>
     </w:p>
     <w:p>
@@ -2419,7 +2344,7 @@
         <w:t xml:space="preserve">Next  </w:t>
       </w:r>
       <w:r>
-        <w:t>Connect Water with Topography before choosing storage, planting or earthworks.</w:t>
+        <w:t>Connect Stewardship with Wildlife and Feedback so care becomes part of the learning cycle.</w:t>
       </w:r>
     </w:p>
     <w:p>
@@ -2433,7 +2358,7 @@
         <w:t xml:space="preserve">Connect  </w:t>
       </w:r>
       <w:r>
-        <w:t>Topography</w:t>
+        <w:t>Wildlife · Feedback</w:t>
       </w:r>
     </w:p>
     <w:p>
@@ -2451,10 +2376,10 @@
     </w:p>
     <w:p>
       <w:pPr>
-        <w:pStyle w:val="Heading3"/>
-      </w:pPr>
-      <w:r>
-        <w:t>Stewardship</w:t>
+        <w:pStyle w:val="Heading2"/>
+      </w:pPr>
+      <w:r>
+        <w:t>Shape the Outcome</w:t>
       </w:r>
     </w:p>
     <w:p>
@@ -2467,12 +2392,12 @@
           <w:color w:val="505050"/>
           <w:sz w:val="18"/>
         </w:rPr>
-        <w:t>Stable ID  lim-intro-food-stewardship    Parent ID  lim-intro-food-forest</w:t>
-      </w:r>
-    </w:p>
-    <w:p>
-      <w:r>
-        <w:t>Stewardship is the continuing work of observing, maintaining, harvesting and adapting a living system. It includes safety, shared responsibility and care for wildlife as well as plants; a design that nobody can maintain is incomplete.</w:t>
+        <w:t>Stable ID  lim-intro-smart    Parent ID  none</w:t>
+      </w:r>
+    </w:p>
+    <w:p>
+      <w:r>
+        <w:t>Shape the Outcome turns observations into a shared direction and useful decisions. Vision, clear goals, measurable outcomes, honest limits, practical choices and feedback keep technology connected to the living place it serves; the interface should inform care rather than replace it.</w:t>
       </w:r>
     </w:p>
     <w:p>
@@ -2486,7 +2411,7 @@
         <w:t xml:space="preserve">Explore  </w:t>
       </w:r>
       <w:r>
-        <w:t>Observation · Maintenance · Harvest · Pruning · Safety · Shared roles · Adaptation</w:t>
+        <w:t>Vision · Goals · Outcomes · Limitations · Challenges · Decisions · Feedback</w:t>
       </w:r>
     </w:p>
     <w:p>
@@ -2500,7 +2425,7 @@
         <w:t xml:space="preserve">Look for  </w:t>
       </w:r>
       <w:r>
-        <w:t>Who notices change, who has access, which tasks repeat, when intervention is needed and where care could cause unintended harm.</w:t>
+        <w:t>A future worth working toward, a decision that needs evidence, the people affected, a responsible person and the moment when the result should be reviewed.</w:t>
       </w:r>
     </w:p>
     <w:p>
@@ -2514,7 +2439,7 @@
         <w:t xml:space="preserve">Ask  </w:t>
       </w:r>
       <w:r>
-        <w:t>What care does this place need next, who can provide it, and how will their observations return to the knowledge mesh?</w:t>
+        <w:t>What future should this work help create, what can the system help people notice, and what must remain a human judgement made in the place?</w:t>
       </w:r>
     </w:p>
     <w:p>
@@ -2528,21 +2453,7 @@
         <w:t xml:space="preserve">Next  </w:t>
       </w:r>
       <w:r>
-        <w:t>Connect Stewardship with Wildlife and Feedback so care becomes part of the learning cycle.</w:t>
-      </w:r>
-    </w:p>
-    <w:p>
-      <w:pPr>
-        <w:spacing w:after="80"/>
-      </w:pPr>
-      <w:r>
-        <w:rPr>
-          <w:b/>
-        </w:rPr>
-        <w:t xml:space="preserve">Connect  </w:t>
-      </w:r>
-      <w:r>
-        <w:t>Wildlife · Feedback</w:t>
+        <w:t>Begin with Vision, connect it to a goal or decision, make uncertainty visible, then return through Feedback to Read Nature again.</w:t>
       </w:r>
     </w:p>
     <w:p>
@@ -2560,10 +2471,10 @@
     </w:p>
     <w:p>
       <w:pPr>
-        <w:pStyle w:val="Heading2"/>
-      </w:pPr>
-      <w:r>
-        <w:t>Shape the Outcome</w:t>
+        <w:pStyle w:val="Heading3"/>
+      </w:pPr>
+      <w:r>
+        <w:t>Vision</w:t>
       </w:r>
     </w:p>
     <w:p>
@@ -2576,12 +2487,12 @@
           <w:color w:val="505050"/>
           <w:sz w:val="18"/>
         </w:rPr>
-        <w:t>Stable ID  lim-intro-smart    Parent ID  lim-intro-vision</w:t>
-      </w:r>
-    </w:p>
-    <w:p>
-      <w:r>
-        <w:t>Shape the Outcome turns observations into useful decisions. Clear goals, measurable outcomes, honest limits, practical choices and feedback keep technology connected to the living place it serves; the interface should inform care rather than replace it.</w:t>
+        <w:t>Stable ID  lim-intro-vision    Parent ID  lim-intro-smart</w:t>
+      </w:r>
+    </w:p>
+    <w:p>
+      <w:r>
+        <w:t>Vision describes the future a project hopes to help create for a living place. It gives goals and decisions a shared direction without pretending the future is fixed; observation, participation and feedback can refine the vision as the place changes.</w:t>
       </w:r>
     </w:p>
     <w:p>
@@ -2595,7 +2506,7 @@
         <w:t xml:space="preserve">Explore  </w:t>
       </w:r>
       <w:r>
-        <w:t>Goals · Outcomes · Limitations · Challenges · Decisions · Feedback</w:t>
+        <w:t>Purpose · Future state · Values · People · Place · Time horizon</w:t>
       </w:r>
     </w:p>
     <w:p>
@@ -2609,7 +2520,7 @@
         <w:t xml:space="preserve">Look for  </w:t>
       </w:r>
       <w:r>
-        <w:t>A decision that needs evidence, the people affected, a responsible person and the moment when the result should be reviewed.</w:t>
+        <w:t>The people and living systems included, the values guiding the work, a meaningful time horizon and signs that the imagined future still belongs to this place.</w:t>
       </w:r>
     </w:p>
     <w:p>
@@ -2623,7 +2534,7 @@
         <w:t xml:space="preserve">Ask  </w:t>
       </w:r>
       <w:r>
-        <w:t>What can the system help people notice, and what must remain a human judgement made in the place?</w:t>
+        <w:t>What future is worth working toward here, who should help shape it, and what would show that the vision needs to change?</w:t>
       </w:r>
     </w:p>
     <w:p>
@@ -2637,7 +2548,117 @@
         <w:t xml:space="preserve">Next  </w:t>
       </w:r>
       <w:r>
-        <w:t>Choose a goal or decision, make uncertainty visible, then return through Feedback to Read the Place again.</w:t>
+        <w:t>Connect Vision with Goals and Outcomes, then use Feedback to keep the shared direction responsive to the living place.</w:t>
+      </w:r>
+    </w:p>
+    <w:p>
+      <w:pPr>
+        <w:spacing w:before="20" w:after="120"/>
+      </w:pPr>
+      <w:r>
+        <w:rPr>
+          <w:b/>
+        </w:rPr>
+        <w:t xml:space="preserve">Connect  </w:t>
+      </w:r>
+      <w:r>
+        <w:t>Goals · Outcomes</w:t>
+      </w:r>
+    </w:p>
+    <w:p>
+      <w:pPr>
+        <w:pStyle w:val="Heading3"/>
+      </w:pPr>
+      <w:r>
+        <w:t>Goals</w:t>
+      </w:r>
+    </w:p>
+    <w:p>
+      <w:pPr>
+        <w:keepNext/>
+        <w:spacing w:after="100"/>
+      </w:pPr>
+      <w:r>
+        <w:rPr>
+          <w:color w:val="505050"/>
+          <w:sz w:val="18"/>
+        </w:rPr>
+        <w:t>Stable ID  lim-intro-smart-goals    Parent ID  lim-intro-smart</w:t>
+      </w:r>
+    </w:p>
+    <w:p>
+      <w:r>
+        <w:t>Goals describe the change a project is trying to create for particular people and a particular place. A clear purpose, timeframe and priority make it easier to choose what to observe, build and measure, and give a team a shared reason to return.</w:t>
+      </w:r>
+    </w:p>
+    <w:p>
+      <w:pPr>
+        <w:spacing w:after="80"/>
+      </w:pPr>
+      <w:r>
+        <w:rPr>
+          <w:b/>
+        </w:rPr>
+        <w:t xml:space="preserve">Explore  </w:t>
+      </w:r>
+      <w:r>
+        <w:t>Purpose · People · Place · Timeframe · Priorities · Meaning of success</w:t>
+      </w:r>
+    </w:p>
+    <w:p>
+      <w:pPr>
+        <w:spacing w:after="80"/>
+      </w:pPr>
+      <w:r>
+        <w:rPr>
+          <w:b/>
+        </w:rPr>
+        <w:t xml:space="preserve">Look for  </w:t>
+      </w:r>
+      <w:r>
+        <w:t>Who benefits, what changes, where it changes, when it matters and how success would be recognised without the interface.</w:t>
+      </w:r>
+    </w:p>
+    <w:p>
+      <w:pPr>
+        <w:spacing w:after="80"/>
+      </w:pPr>
+      <w:r>
+        <w:rPr>
+          <w:b/>
+        </w:rPr>
+        <w:t xml:space="preserve">Ask  </w:t>
+      </w:r>
+      <w:r>
+        <w:t>Can the goal guide a real decision for the person caring for the place, or is it still too broad to act on?</w:t>
+      </w:r>
+    </w:p>
+    <w:p>
+      <w:pPr>
+        <w:spacing w:after="80"/>
+      </w:pPr>
+      <w:r>
+        <w:rPr>
+          <w:b/>
+        </w:rPr>
+        <w:t xml:space="preserve">Next  </w:t>
+      </w:r>
+      <w:r>
+        <w:t>Connect Goals with Strategy and Decisions, then define an Outcome that could show progress.</w:t>
+      </w:r>
+    </w:p>
+    <w:p>
+      <w:pPr>
+        <w:spacing w:after="80"/>
+      </w:pPr>
+      <w:r>
+        <w:rPr>
+          <w:b/>
+        </w:rPr>
+        <w:t xml:space="preserve">Connect  </w:t>
+      </w:r>
+      <w:r>
+        <w:t>Strategy · Decisions</w:t>
       </w:r>
     </w:p>
     <w:p>
@@ -2658,7 +2679,7 @@
         <w:pStyle w:val="Heading3"/>
       </w:pPr>
       <w:r>
-        <w:t>Goals</w:t>
+        <w:t>Outcomes</w:t>
       </w:r>
     </w:p>
     <w:p>
@@ -2671,12 +2692,12 @@
           <w:color w:val="505050"/>
           <w:sz w:val="18"/>
         </w:rPr>
-        <w:t>Stable ID  lim-intro-smart-goals    Parent ID  lim-intro-smart</w:t>
-      </w:r>
-    </w:p>
-    <w:p>
-      <w:r>
-        <w:t>Goals describe the change a project is trying to create for particular people and a particular place. A clear purpose, timeframe and priority make it easier to choose what to observe, build and measure, and give a team a shared reason to return.</w:t>
+        <w:t>Stable ID  lim-intro-smart-outcomes    Parent ID  lim-intro-smart</w:t>
+      </w:r>
+    </w:p>
+    <w:p>
+      <w:r>
+        <w:t>Outcomes are the changes that follow from action. Indicators may include yield, resilience, habitat or learning, but intended results must be compared with what actually happens, including effects that were not expected.</w:t>
       </w:r>
     </w:p>
     <w:p>
@@ -2690,7 +2711,7 @@
         <w:t xml:space="preserve">Explore  </w:t>
       </w:r>
       <w:r>
-        <w:t>Purpose · People · Place · Timeframe · Priorities · Meaning of success</w:t>
+        <w:t>Indicators · Yield · Resilience · Habitat · Learning · Unintended effects</w:t>
       </w:r>
     </w:p>
     <w:p>
@@ -2704,7 +2725,7 @@
         <w:t xml:space="preserve">Look for  </w:t>
       </w:r>
       <w:r>
-        <w:t>Who benefits, what changes, where it changes, when it matters and how success would be recognised without the interface.</w:t>
+        <w:t>A visible change, a useful measure, a time window and consequences for other plants, people, wildlife or future care.</w:t>
       </w:r>
     </w:p>
     <w:p>
@@ -2718,7 +2739,7 @@
         <w:t xml:space="preserve">Ask  </w:t>
       </w:r>
       <w:r>
-        <w:t>Can the goal guide a real decision for the person caring for the place, or is it still too broad to act on?</w:t>
+        <w:t>What would count as evidence of progress, and what result would make the project pause or change course?</w:t>
       </w:r>
     </w:p>
     <w:p>
@@ -2732,7 +2753,7 @@
         <w:t xml:space="preserve">Next  </w:t>
       </w:r>
       <w:r>
-        <w:t>Connect Goals with Strategy and Decisions, then define an Outcome that could show progress.</w:t>
+        <w:t>Connect Outcomes with Fruit where harvest is relevant, then use Feedback to carry the result into the next decision.</w:t>
       </w:r>
     </w:p>
     <w:p>
@@ -2746,7 +2767,7 @@
         <w:t xml:space="preserve">Connect  </w:t>
       </w:r>
       <w:r>
-        <w:t>Strategy · Decisions</w:t>
+        <w:t>Fruit · Feedback</w:t>
       </w:r>
     </w:p>
     <w:p>
@@ -2767,7 +2788,7 @@
         <w:pStyle w:val="Heading3"/>
       </w:pPr>
       <w:r>
-        <w:t>Outcomes</w:t>
+        <w:t>Limitations</w:t>
       </w:r>
     </w:p>
     <w:p>
@@ -2780,12 +2801,12 @@
           <w:color w:val="505050"/>
           <w:sz w:val="18"/>
         </w:rPr>
-        <w:t>Stable ID  lim-intro-smart-outcomes    Parent ID  lim-intro-smart</w:t>
-      </w:r>
-    </w:p>
-    <w:p>
-      <w:r>
-        <w:t>Outcomes are the changes that follow from action. Indicators may include yield, resilience, habitat or learning, but intended results must be compared with what actually happens, including effects that were not expected.</w:t>
+        <w:t>Stable ID  lim-intro-smart-limitations    Parent ID  lim-intro-smart</w:t>
+      </w:r>
+    </w:p>
+    <w:p>
+      <w:r>
+        <w:t>Every observation, tool and dataset has limits. Naming missing evidence, seasonal bias, uneven access, available time, technical constraints and uncertain identification makes the knowledge more useful and prevents the interface from creating false confidence.</w:t>
       </w:r>
     </w:p>
     <w:p>
@@ -2799,7 +2820,7 @@
         <w:t xml:space="preserve">Explore  </w:t>
       </w:r>
       <w:r>
-        <w:t>Indicators · Yield · Resilience · Habitat · Learning · Unintended effects</w:t>
+        <w:t>Missing data · Seasonal bias · Access · Time and budget · Capacity · Technology · Uncertainty</w:t>
       </w:r>
     </w:p>
     <w:p>
@@ -2813,7 +2834,7 @@
         <w:t xml:space="preserve">Look for  </w:t>
       </w:r>
       <w:r>
-        <w:t>A visible change, a useful measure, a time window and consequences for other plants, people, wildlife or future care.</w:t>
+        <w:t>What was not measured, who was absent, which source is old, what the sensor cannot see and where care capacity is limited.</w:t>
       </w:r>
     </w:p>
     <w:p>
@@ -2827,7 +2848,7 @@
         <w:t xml:space="preserve">Ask  </w:t>
       </w:r>
       <w:r>
-        <w:t>What would count as evidence of progress, and what result would make the project pause or change course?</w:t>
+        <w:t>What would need to be known before making a stronger claim or committing to a less reversible action?</w:t>
       </w:r>
     </w:p>
     <w:p>
@@ -2841,7 +2862,7 @@
         <w:t xml:space="preserve">Next  </w:t>
       </w:r>
       <w:r>
-        <w:t>Connect Outcomes with Fruit where harvest is relevant, then use Feedback to carry the result into the next decision.</w:t>
+        <w:t>Connect Limitations with Strategy and Decisions so uncertainty changes the plan instead of being hidden.</w:t>
       </w:r>
     </w:p>
     <w:p>
@@ -2855,7 +2876,7 @@
         <w:t xml:space="preserve">Connect  </w:t>
       </w:r>
       <w:r>
-        <w:t>Fruit · Feedback</w:t>
+        <w:t>Strategy · Decisions</w:t>
       </w:r>
     </w:p>
     <w:p>
@@ -2876,7 +2897,7 @@
         <w:pStyle w:val="Heading3"/>
       </w:pPr>
       <w:r>
-        <w:t>Limitations</w:t>
+        <w:t>Challenges</w:t>
       </w:r>
     </w:p>
     <w:p>
@@ -2889,12 +2910,12 @@
           <w:color w:val="505050"/>
           <w:sz w:val="18"/>
         </w:rPr>
-        <w:t>Stable ID  lim-intro-smart-limitations    Parent ID  lim-intro-smart</w:t>
-      </w:r>
-    </w:p>
-    <w:p>
-      <w:r>
-        <w:t>Every observation, tool and dataset has limits. Naming missing evidence, seasonal bias, uneven access, available time, technical constraints and uncertain identification makes the knowledge more useful and prevents the interface from creating false confidence.</w:t>
+        <w:t>Stable ID  lim-intro-smart-challenges    Parent ID  lim-intro-smart</w:t>
+      </w:r>
+    </w:p>
+    <w:p>
+      <w:r>
+        <w:t>Challenges reveal where more observation, support or experimentation is needed. A problem becomes a learning question when the record keeps possible causes, risk, attempted response, available support and the next review together.</w:t>
       </w:r>
     </w:p>
     <w:p>
@@ -2908,7 +2929,7 @@
         <w:t xml:space="preserve">Explore  </w:t>
       </w:r>
       <w:r>
-        <w:t>Missing data · Seasonal bias · Access · Time and budget · Capacity · Technology · Uncertainty</w:t>
+        <w:t>Problem · Possible causes · Safe experiments · Support · Risks · Review point</w:t>
       </w:r>
     </w:p>
     <w:p>
@@ -2922,7 +2943,7 @@
         <w:t xml:space="preserve">Look for  </w:t>
       </w:r>
       <w:r>
-        <w:t>What was not measured, who was absent, which source is old, what the sensor cannot see and where care capacity is limited.</w:t>
+        <w:t>The bottleneck, people affected, competing explanations, the smallest safe experiment and the signal that would show learning.</w:t>
       </w:r>
     </w:p>
     <w:p>
@@ -2936,7 +2957,7 @@
         <w:t xml:space="preserve">Ask  </w:t>
       </w:r>
       <w:r>
-        <w:t>What would need to be known before making a stronger claim or committing to a less reversible action?</w:t>
+        <w:t>What is the next useful question, what risk must be managed, and who can help answer it in the living place?</w:t>
       </w:r>
     </w:p>
     <w:p>
@@ -2950,7 +2971,7 @@
         <w:t xml:space="preserve">Next  </w:t>
       </w:r>
       <w:r>
-        <w:t>Connect Limitations with Strategy and Decisions so uncertainty changes the plan instead of being hidden.</w:t>
+        <w:t>Connect Challenges with Strategy, then record the experiment as a Decision with a review point.</w:t>
       </w:r>
     </w:p>
     <w:p>
@@ -2964,7 +2985,7 @@
         <w:t xml:space="preserve">Connect  </w:t>
       </w:r>
       <w:r>
-        <w:t>Strategy · Decisions</w:t>
+        <w:t>Strategy</w:t>
       </w:r>
     </w:p>
     <w:p>
@@ -2985,7 +3006,7 @@
         <w:pStyle w:val="Heading3"/>
       </w:pPr>
       <w:r>
-        <w:t>Challenges</w:t>
+        <w:t>Decisions</w:t>
       </w:r>
     </w:p>
     <w:p>
@@ -2998,12 +3019,12 @@
           <w:color w:val="505050"/>
           <w:sz w:val="18"/>
         </w:rPr>
-        <w:t>Stable ID  lim-intro-smart-challenges    Parent ID  lim-intro-smart</w:t>
-      </w:r>
-    </w:p>
-    <w:p>
-      <w:r>
-        <w:t>Challenges reveal where more observation, support or experimentation is needed. A problem becomes a learning question when the record keeps possible causes, risk, attempted response, available support and the next review together.</w:t>
+        <w:t>Stable ID  lim-intro-smart-decisions    Parent ID  lim-intro-smart</w:t>
+      </w:r>
+    </w:p>
+    <w:p>
+      <w:r>
+        <w:t>Decisions turn goals and evidence into a chosen next action. Good decisions make options, trade-offs, responsibility and reversibility visible, especially when knowledge is incomplete; they record why a path was chosen rather than only what happened.</w:t>
       </w:r>
     </w:p>
     <w:p>
@@ -3017,7 +3038,7 @@
         <w:t xml:space="preserve">Explore  </w:t>
       </w:r>
       <w:r>
-        <w:t>Problem · Possible causes · Safe experiments · Support · Risks · Review point</w:t>
+        <w:t>Options · Trade-offs · Evidence · Responsibility · Reversibility · Next action</w:t>
       </w:r>
     </w:p>
     <w:p>
@@ -3031,7 +3052,7 @@
         <w:t xml:space="preserve">Look for  </w:t>
       </w:r>
       <w:r>
-        <w:t>The bottleneck, people affected, competing explanations, the smallest safe experiment and the signal that would show learning.</w:t>
+        <w:t>The available options, evidence behind each one, people affected, cost of reversal and person responsible for follow-through.</w:t>
       </w:r>
     </w:p>
     <w:p>
@@ -3045,7 +3066,7 @@
         <w:t xml:space="preserve">Ask  </w:t>
       </w:r>
       <w:r>
-        <w:t>What is the next useful question, what risk must be managed, and who can help answer it in the living place?</w:t>
+        <w:t>Which option best serves the goal within current limits, and what new evidence would justify changing it?</w:t>
       </w:r>
     </w:p>
     <w:p>
@@ -3059,7 +3080,7 @@
         <w:t xml:space="preserve">Next  </w:t>
       </w:r>
       <w:r>
-        <w:t>Connect Challenges with Strategy, then record the experiment as a Decision with a review point.</w:t>
+        <w:t>Connect Decisions with Goals and Limitations, then define the observation that will create useful Feedback.</w:t>
       </w:r>
     </w:p>
     <w:p>
@@ -3073,7 +3094,7 @@
         <w:t xml:space="preserve">Connect  </w:t>
       </w:r>
       <w:r>
-        <w:t>Strategy</w:t>
+        <w:t>Goals · Limitations</w:t>
       </w:r>
     </w:p>
     <w:p>
@@ -3094,7 +3115,7 @@
         <w:pStyle w:val="Heading3"/>
       </w:pPr>
       <w:r>
-        <w:t>Decisions</w:t>
+        <w:t>Feedback</w:t>
       </w:r>
     </w:p>
     <w:p>
@@ -3107,12 +3128,12 @@
           <w:color w:val="505050"/>
           <w:sz w:val="18"/>
         </w:rPr>
-        <w:t>Stable ID  lim-intro-smart-decisions    Parent ID  lim-intro-smart</w:t>
-      </w:r>
-    </w:p>
-    <w:p>
-      <w:r>
-        <w:t>Decisions turn goals and evidence into a chosen next action. Good decisions make options, trade-offs, responsibility and reversibility visible, especially when knowledge is incomplete; they record why a path was chosen rather than only what happened.</w:t>
+        <w:t>Stable ID  lim-intro-smart-feedback    Parent ID  lim-intro-smart</w:t>
+      </w:r>
+    </w:p>
+    <w:p>
+      <w:r>
+        <w:t>Feedback closes the learning cycle: observe what happened, record enough context, compare it with the goal, learn from difference and adjust the next action. It turns the LIM from a one-way explanation into a living record that improves through return visits.</w:t>
       </w:r>
     </w:p>
     <w:p>
@@ -3126,7 +3147,7 @@
         <w:t xml:space="preserve">Explore  </w:t>
       </w:r>
       <w:r>
-        <w:t>Options · Trade-offs · Evidence · Responsibility · Reversibility · Next action</w:t>
+        <w:t>Observe · Record · Compare · Learn · Adjust · Return to place</w:t>
       </w:r>
     </w:p>
     <w:p>
@@ -3140,7 +3161,7 @@
         <w:t xml:space="preserve">Look for  </w:t>
       </w:r>
       <w:r>
-        <w:t>The available options, evidence behind each one, people affected, cost of reversal and person responsible for follow-through.</w:t>
+        <w:t>A previous expectation, a dated observation, a meaningful difference, an interpretation and the next moment to check again.</w:t>
       </w:r>
     </w:p>
     <w:p>
@@ -3154,7 +3175,7 @@
         <w:t xml:space="preserve">Ask  </w:t>
       </w:r>
       <w:r>
-        <w:t>Which option best serves the goal within current limits, and what new evidence would justify changing it?</w:t>
+        <w:t>What changed, how confident is that reading, and what should be observed when the place is revisited?</w:t>
       </w:r>
     </w:p>
     <w:p>
@@ -3168,7 +3189,7 @@
         <w:t xml:space="preserve">Next  </w:t>
       </w:r>
       <w:r>
-        <w:t>Connect Decisions with Goals and Limitations, then define the observation that will create useful Feedback.</w:t>
+        <w:t>Return to Read Nature. The new observation may change the strategy, design or goal.</w:t>
       </w:r>
     </w:p>
     <w:p>
@@ -3182,116 +3203,7 @@
         <w:t xml:space="preserve">Connect  </w:t>
       </w:r>
       <w:r>
-        <w:t>Goals · Limitations</w:t>
-      </w:r>
-    </w:p>
-    <w:p>
-      <w:pPr>
-        <w:spacing w:before="20" w:after="120"/>
-      </w:pPr>
-      <w:r>
-        <w:rPr>
-          <w:b/>
-          <w:color w:val="505050"/>
-          <w:sz w:val="18"/>
-        </w:rPr>
-        <w:t xml:space="preserve">Review notes  </w:t>
-      </w:r>
-    </w:p>
-    <w:p>
-      <w:pPr>
-        <w:pStyle w:val="Heading3"/>
-      </w:pPr>
-      <w:r>
-        <w:t>Feedback</w:t>
-      </w:r>
-    </w:p>
-    <w:p>
-      <w:pPr>
-        <w:keepNext/>
-        <w:spacing w:after="100"/>
-      </w:pPr>
-      <w:r>
-        <w:rPr>
-          <w:color w:val="505050"/>
-          <w:sz w:val="18"/>
-        </w:rPr>
-        <w:t>Stable ID  lim-intro-smart-feedback    Parent ID  lim-intro-smart</w:t>
-      </w:r>
-    </w:p>
-    <w:p>
-      <w:r>
-        <w:t>Feedback closes the learning cycle: observe what happened, record enough context, compare it with the goal, learn from difference and adjust the next action. It turns the LIM from a one-way explanation into a living record that improves through return visits.</w:t>
-      </w:r>
-    </w:p>
-    <w:p>
-      <w:pPr>
-        <w:spacing w:after="80"/>
-      </w:pPr>
-      <w:r>
-        <w:rPr>
-          <w:b/>
-        </w:rPr>
-        <w:t xml:space="preserve">Explore  </w:t>
-      </w:r>
-      <w:r>
-        <w:t>Observe · Record · Compare · Learn · Adjust · Return to place</w:t>
-      </w:r>
-    </w:p>
-    <w:p>
-      <w:pPr>
-        <w:spacing w:after="80"/>
-      </w:pPr>
-      <w:r>
-        <w:rPr>
-          <w:b/>
-        </w:rPr>
-        <w:t xml:space="preserve">Look for  </w:t>
-      </w:r>
-      <w:r>
-        <w:t>A previous expectation, a dated observation, a meaningful difference, an interpretation and the next moment to check again.</w:t>
-      </w:r>
-    </w:p>
-    <w:p>
-      <w:pPr>
-        <w:spacing w:after="80"/>
-      </w:pPr>
-      <w:r>
-        <w:rPr>
-          <w:b/>
-        </w:rPr>
-        <w:t xml:space="preserve">Ask  </w:t>
-      </w:r>
-      <w:r>
-        <w:t>What changed, how confident is that reading, and what should be observed when the place is revisited?</w:t>
-      </w:r>
-    </w:p>
-    <w:p>
-      <w:pPr>
-        <w:spacing w:after="80"/>
-      </w:pPr>
-      <w:r>
-        <w:rPr>
-          <w:b/>
-        </w:rPr>
-        <w:t xml:space="preserve">Next  </w:t>
-      </w:r>
-      <w:r>
-        <w:t>Return to Read the Place. The new observation may change the strategy, design or goal.</w:t>
-      </w:r>
-    </w:p>
-    <w:p>
-      <w:pPr>
-        <w:spacing w:after="80"/>
-      </w:pPr>
-      <w:r>
-        <w:rPr>
-          <w:b/>
-        </w:rPr>
-        <w:t xml:space="preserve">Connect  </w:t>
-      </w:r>
-      <w:r>
-        <w:t>Read the Place · Stewardship · Outcomes</w:t>
+        <w:t>Read Nature · Stewardship · Outcomes</w:t>
       </w:r>
     </w:p>
     <w:p>

</xml_diff>